<commit_message>
기술문서 사이트 갱신(clinical-agent b66c5f9)
</commit_message>
<xml_diff>
--- a/onprem-ops/03-onprem-security-ops.docx
+++ b/onprem-ops/03-onprem-security-ops.docx
@@ -100,7 +100,7 @@
               <w:pStyle w:val="Compact"/>
             </w:pPr>
             <w:r>
-              <w:t xml:space="preserve">0.1 (검토 전 초안)</w:t>
+              <w:t xml:space="preserve">0.1</w:t>
             </w:r>
           </w:p>
         </w:tc>
@@ -172,7 +172,7 @@
               <w:pStyle w:val="Compact"/>
             </w:pPr>
             <w:r>
-              <w:t xml:space="preserve">clinical-agent 90998d9</w:t>
+              <w:t xml:space="preserve">clinical-agent b66c5f9</w:t>
             </w:r>
           </w:p>
         </w:tc>

</xml_diff>